<commit_message>
feat(K-AI): 5대 핵심 16:9 일러스트 이미지 생성 및 HTML/DOCX/MD 반영, Dell 템플릿(PPTX) 수신
</commit_message>
<xml_diff>
--- a/K-AI/2026-09-09_Korea_Sovereign_AI_Strategy_Deck.docx
+++ b/K-AI/2026-09-09_Korea_Sovereign_AI_Strategy_Deck.docx
@@ -371,6 +371,46 @@
               <w:t>Futuristic visual blending Seoul skyline, AI neural nodes, and enterprise server racks.</w:t>
             </w:r>
           </w:p>
+          <w:p>
+            <w:pPr>
+              <w:spacing w:before="120" w:after="80"/>
+              <w:jc w:val="center"/>
+            </w:pPr>
+            <w:r>
+              <w:drawing>
+                <wp:inline xmlns:a="http://schemas.openxmlformats.org/drawingml/2006/main" xmlns:pic="http://schemas.openxmlformats.org/drawingml/2006/picture">
+                  <wp:extent cx="4937760" cy="2755959"/>
+                  <wp:docPr id="1" name="Picture 1"/>
+                  <wp:cNvGraphicFramePr>
+                    <a:graphicFrameLocks noChangeAspect="1"/>
+                  </wp:cNvGraphicFramePr>
+                  <a:graphic>
+                    <a:graphicData uri="http://schemas.openxmlformats.org/drawingml/2006/picture">
+                      <pic:pic>
+                        <pic:nvPicPr>
+                          <pic:cNvPr id="0" name="slide01_cover_sovereign_ai.jpg"/>
+                          <pic:cNvPicPr/>
+                        </pic:nvPicPr>
+                        <pic:blipFill>
+                          <a:blip r:embed="rId9"/>
+                          <a:stretch>
+                            <a:fillRect/>
+                          </a:stretch>
+                        </pic:blipFill>
+                        <pic:spPr>
+                          <a:xfrm>
+                            <a:off x="0" y="0"/>
+                            <a:ext cx="4937760" cy="2755959"/>
+                          </a:xfrm>
+                          <a:prstGeom prst="rect"/>
+                        </pic:spPr>
+                      </pic:pic>
+                    </a:graphicData>
+                  </a:graphic>
+                </wp:inline>
+              </w:drawing>
+            </w:r>
+          </w:p>
         </w:tc>
       </w:tr>
       <w:tr>
@@ -1700,6 +1740,46 @@
               <w:t>Architectural rendering of Haenam Solaseado datacenter campus with green energy grid connections.</w:t>
             </w:r>
           </w:p>
+          <w:p>
+            <w:pPr>
+              <w:spacing w:before="120" w:after="80"/>
+              <w:jc w:val="center"/>
+            </w:pPr>
+            <w:r>
+              <w:drawing>
+                <wp:inline xmlns:a="http://schemas.openxmlformats.org/drawingml/2006/main" xmlns:pic="http://schemas.openxmlformats.org/drawingml/2006/picture">
+                  <wp:extent cx="4937760" cy="2755959"/>
+                  <wp:docPr id="2" name="Picture 2"/>
+                  <wp:cNvGraphicFramePr>
+                    <a:graphicFrameLocks noChangeAspect="1"/>
+                  </wp:cNvGraphicFramePr>
+                  <a:graphic>
+                    <a:graphicData uri="http://schemas.openxmlformats.org/drawingml/2006/picture">
+                      <pic:pic>
+                        <pic:nvPicPr>
+                          <pic:cNvPr id="0" name="slide07_infra_knpu_datacenter.jpg"/>
+                          <pic:cNvPicPr/>
+                        </pic:nvPicPr>
+                        <pic:blipFill>
+                          <a:blip r:embed="rId10"/>
+                          <a:stretch>
+                            <a:fillRect/>
+                          </a:stretch>
+                        </pic:blipFill>
+                        <pic:spPr>
+                          <a:xfrm>
+                            <a:off x="0" y="0"/>
+                            <a:ext cx="4937760" cy="2755959"/>
+                          </a:xfrm>
+                          <a:prstGeom prst="rect"/>
+                        </pic:spPr>
+                      </pic:pic>
+                    </a:graphicData>
+                  </a:graphic>
+                </wp:inline>
+              </w:drawing>
+            </w:r>
+          </w:p>
         </w:tc>
       </w:tr>
       <w:tr>
@@ -4282,6 +4362,46 @@
               <w:t>Detailed 4-Layer architectural diagram displaying software logos and interface protocols.</w:t>
             </w:r>
           </w:p>
+          <w:p>
+            <w:pPr>
+              <w:spacing w:before="120" w:after="80"/>
+              <w:jc w:val="center"/>
+            </w:pPr>
+            <w:r>
+              <w:drawing>
+                <wp:inline xmlns:a="http://schemas.openxmlformats.org/drawingml/2006/main" xmlns:pic="http://schemas.openxmlformats.org/drawingml/2006/picture">
+                  <wp:extent cx="4937760" cy="2755959"/>
+                  <wp:docPr id="3" name="Picture 3"/>
+                  <wp:cNvGraphicFramePr>
+                    <a:graphicFrameLocks noChangeAspect="1"/>
+                  </wp:cNvGraphicFramePr>
+                  <a:graphic>
+                    <a:graphicData uri="http://schemas.openxmlformats.org/drawingml/2006/picture">
+                      <pic:pic>
+                        <pic:nvPicPr>
+                          <pic:cNvPr id="0" name="slide19_solution_4layer_architecture.jpg"/>
+                          <pic:cNvPicPr/>
+                        </pic:nvPicPr>
+                        <pic:blipFill>
+                          <a:blip r:embed="rId11"/>
+                          <a:stretch>
+                            <a:fillRect/>
+                          </a:stretch>
+                        </pic:blipFill>
+                        <pic:spPr>
+                          <a:xfrm>
+                            <a:off x="0" y="0"/>
+                            <a:ext cx="4937760" cy="2755959"/>
+                          </a:xfrm>
+                          <a:prstGeom prst="rect"/>
+                        </pic:spPr>
+                      </pic:pic>
+                    </a:graphicData>
+                  </a:graphic>
+                </wp:inline>
+              </w:drawing>
+            </w:r>
+          </w:p>
         </w:tc>
       </w:tr>
       <w:tr>
@@ -5361,6 +5481,46 @@
               <w:t>Product rendering of the 2U rack appliance showing pre-installed software layers and plug-in setup.</w:t>
             </w:r>
           </w:p>
+          <w:p>
+            <w:pPr>
+              <w:spacing w:before="120" w:after="80"/>
+              <w:jc w:val="center"/>
+            </w:pPr>
+            <w:r>
+              <w:drawing>
+                <wp:inline xmlns:a="http://schemas.openxmlformats.org/drawingml/2006/main" xmlns:pic="http://schemas.openxmlformats.org/drawingml/2006/picture">
+                  <wp:extent cx="4937760" cy="2755959"/>
+                  <wp:docPr id="4" name="Picture 4"/>
+                  <wp:cNvGraphicFramePr>
+                    <a:graphicFrameLocks noChangeAspect="1"/>
+                  </wp:cNvGraphicFramePr>
+                  <a:graphic>
+                    <a:graphicData uri="http://schemas.openxmlformats.org/drawingml/2006/picture">
+                      <pic:pic>
+                        <pic:nvPicPr>
+                          <pic:cNvPr id="0" name="slide24_service_turnkey_appliance.jpg"/>
+                          <pic:cNvPicPr/>
+                        </pic:nvPicPr>
+                        <pic:blipFill>
+                          <a:blip r:embed="rId12"/>
+                          <a:stretch>
+                            <a:fillRect/>
+                          </a:stretch>
+                        </pic:blipFill>
+                        <pic:spPr>
+                          <a:xfrm>
+                            <a:off x="0" y="0"/>
+                            <a:ext cx="4937760" cy="2755959"/>
+                          </a:xfrm>
+                          <a:prstGeom prst="rect"/>
+                        </pic:spPr>
+                      </pic:pic>
+                    </a:graphicData>
+                  </a:graphic>
+                </wp:inline>
+              </w:drawing>
+            </w:r>
+          </w:p>
         </w:tc>
       </w:tr>
       <w:tr>
@@ -6264,6 +6424,46 @@
                 <w:sz w:val="17"/>
               </w:rPr>
               <w:t>Global map linking Silicon Valley, Seoul, Tokyo, and Singapore with active business flows.</w:t>
+            </w:r>
+          </w:p>
+          <w:p>
+            <w:pPr>
+              <w:spacing w:before="120" w:after="80"/>
+              <w:jc w:val="center"/>
+            </w:pPr>
+            <w:r>
+              <w:drawing>
+                <wp:inline xmlns:a="http://schemas.openxmlformats.org/drawingml/2006/main" xmlns:pic="http://schemas.openxmlformats.org/drawingml/2006/picture">
+                  <wp:extent cx="4937760" cy="2755959"/>
+                  <wp:docPr id="5" name="Picture 5"/>
+                  <wp:cNvGraphicFramePr>
+                    <a:graphicFrameLocks noChangeAspect="1"/>
+                  </wp:cNvGraphicFramePr>
+                  <a:graphic>
+                    <a:graphicData uri="http://schemas.openxmlformats.org/drawingml/2006/picture">
+                      <pic:pic>
+                        <pic:nvPicPr>
+                          <pic:cNvPr id="0" name="slide28_mzc_global_ai_bridge.jpg"/>
+                          <pic:cNvPicPr/>
+                        </pic:nvPicPr>
+                        <pic:blipFill>
+                          <a:blip r:embed="rId13"/>
+                          <a:stretch>
+                            <a:fillRect/>
+                          </a:stretch>
+                        </pic:blipFill>
+                        <pic:spPr>
+                          <a:xfrm>
+                            <a:off x="0" y="0"/>
+                            <a:ext cx="4937760" cy="2755959"/>
+                          </a:xfrm>
+                          <a:prstGeom prst="rect"/>
+                        </pic:spPr>
+                      </pic:pic>
+                    </a:graphicData>
+                  </a:graphic>
+                </wp:inline>
+              </w:drawing>
             </w:r>
           </w:p>
         </w:tc>

</xml_diff>